<commit_message>
upd years in docs
</commit_message>
<xml_diff>
--- a/templates/CSA_SOW_v250609.docx
+++ b/templates/CSA_SOW_v250609.docx
@@ -2612,13 +2612,19 @@
         <w:t xml:space="preserve">Application Season: 202</w:t>
       </w:r>
       <w:r>
-        <w:t xml:space="preserve">5</w:t>
+        <w:rPr>
+          <w:lang w:val="ru-RU"/>
+        </w:rPr>
+        <w:t xml:space="preserve">6</w:t>
       </w:r>
       <w:r>
         <w:t xml:space="preserve">-202</w:t>
       </w:r>
       <w:r>
-        <w:t xml:space="preserve">6</w:t>
+        <w:rPr>
+          <w:lang w:val="ru-RU"/>
+        </w:rPr>
+        <w:t xml:space="preserve">7</w:t>
       </w:r>
       <w:r/>
     </w:p>
@@ -6445,7 +6451,7 @@
     <w:lvl w:ilvl="1">
       <w:isLgl w:val="false"/>
       <w:lvlJc w:val="left"/>
-      <w:lvlText/>
+      <w:lvlText w:val=""/>
       <w:numFmt w:val="none"/>
       <w:pPr>
         <w:pBdr/>
@@ -6463,7 +6469,7 @@
     <w:lvl w:ilvl="2">
       <w:isLgl w:val="false"/>
       <w:lvlJc w:val="left"/>
-      <w:lvlText/>
+      <w:lvlText w:val=""/>
       <w:numFmt w:val="none"/>
       <w:pPr>
         <w:pBdr/>
@@ -6481,7 +6487,7 @@
     <w:lvl w:ilvl="3">
       <w:isLgl w:val="false"/>
       <w:lvlJc w:val="left"/>
-      <w:lvlText/>
+      <w:lvlText w:val=""/>
       <w:numFmt w:val="none"/>
       <w:pPr>
         <w:pBdr/>
@@ -6499,7 +6505,7 @@
     <w:lvl w:ilvl="4">
       <w:isLgl w:val="false"/>
       <w:lvlJc w:val="left"/>
-      <w:lvlText/>
+      <w:lvlText w:val=""/>
       <w:numFmt w:val="none"/>
       <w:pPr>
         <w:pBdr/>
@@ -6517,7 +6523,7 @@
     <w:lvl w:ilvl="5">
       <w:isLgl w:val="false"/>
       <w:lvlJc w:val="left"/>
-      <w:lvlText/>
+      <w:lvlText w:val=""/>
       <w:numFmt w:val="none"/>
       <w:pPr>
         <w:pBdr/>
@@ -6535,7 +6541,7 @@
     <w:lvl w:ilvl="6">
       <w:isLgl w:val="false"/>
       <w:lvlJc w:val="left"/>
-      <w:lvlText/>
+      <w:lvlText w:val=""/>
       <w:numFmt w:val="none"/>
       <w:pPr>
         <w:pBdr/>
@@ -6553,7 +6559,7 @@
     <w:lvl w:ilvl="7">
       <w:isLgl w:val="false"/>
       <w:lvlJc w:val="left"/>
-      <w:lvlText/>
+      <w:lvlText w:val=""/>
       <w:numFmt w:val="none"/>
       <w:pPr>
         <w:pBdr/>
@@ -6571,7 +6577,7 @@
     <w:lvl w:ilvl="8">
       <w:isLgl w:val="false"/>
       <w:lvlJc w:val="left"/>
-      <w:lvlText/>
+      <w:lvlText w:val=""/>
       <w:numFmt w:val="none"/>
       <w:pPr>
         <w:pBdr/>
@@ -6605,7 +6611,7 @@
     <w:lvl w:ilvl="1">
       <w:isLgl w:val="false"/>
       <w:lvlJc w:val="left"/>
-      <w:lvlText/>
+      <w:lvlText w:val=""/>
       <w:numFmt w:val="bullet"/>
       <w:pPr>
         <w:pBdr/>
@@ -6619,7 +6625,7 @@
     <w:lvl w:ilvl="2">
       <w:isLgl w:val="false"/>
       <w:lvlJc w:val="left"/>
-      <w:lvlText/>
+      <w:lvlText w:val=""/>
       <w:numFmt w:val="bullet"/>
       <w:pPr>
         <w:pBdr/>
@@ -6633,7 +6639,7 @@
     <w:lvl w:ilvl="3">
       <w:isLgl w:val="false"/>
       <w:lvlJc w:val="left"/>
-      <w:lvlText/>
+      <w:lvlText w:val=""/>
       <w:numFmt w:val="bullet"/>
       <w:pPr>
         <w:pBdr/>
@@ -6647,7 +6653,7 @@
     <w:lvl w:ilvl="4">
       <w:isLgl w:val="false"/>
       <w:lvlJc w:val="left"/>
-      <w:lvlText/>
+      <w:lvlText w:val=""/>
       <w:numFmt w:val="bullet"/>
       <w:pPr>
         <w:pBdr/>
@@ -6661,7 +6667,7 @@
     <w:lvl w:ilvl="5">
       <w:isLgl w:val="false"/>
       <w:lvlJc w:val="left"/>
-      <w:lvlText/>
+      <w:lvlText w:val=""/>
       <w:numFmt w:val="bullet"/>
       <w:pPr>
         <w:pBdr/>
@@ -6675,7 +6681,7 @@
     <w:lvl w:ilvl="6">
       <w:isLgl w:val="false"/>
       <w:lvlJc w:val="left"/>
-      <w:lvlText/>
+      <w:lvlText w:val=""/>
       <w:numFmt w:val="bullet"/>
       <w:pPr>
         <w:pBdr/>
@@ -6689,7 +6695,7 @@
     <w:lvl w:ilvl="7">
       <w:isLgl w:val="false"/>
       <w:lvlJc w:val="left"/>
-      <w:lvlText/>
+      <w:lvlText w:val=""/>
       <w:numFmt w:val="bullet"/>
       <w:pPr>
         <w:pBdr/>
@@ -6703,7 +6709,7 @@
     <w:lvl w:ilvl="8">
       <w:isLgl w:val="false"/>
       <w:lvlJc w:val="left"/>
-      <w:lvlText/>
+      <w:lvlText w:val=""/>
       <w:numFmt w:val="bullet"/>
       <w:pPr>
         <w:pBdr/>
@@ -7350,7 +7356,7 @@
     <w:lvl w:ilvl="1">
       <w:isLgl w:val="false"/>
       <w:lvlJc w:val="left"/>
-      <w:lvlText/>
+      <w:lvlText w:val=""/>
       <w:numFmt w:val="bullet"/>
       <w:pPr>
         <w:pBdr/>
@@ -7364,7 +7370,7 @@
     <w:lvl w:ilvl="2">
       <w:isLgl w:val="false"/>
       <w:lvlJc w:val="left"/>
-      <w:lvlText/>
+      <w:lvlText w:val=""/>
       <w:numFmt w:val="bullet"/>
       <w:pPr>
         <w:pBdr/>
@@ -7378,7 +7384,7 @@
     <w:lvl w:ilvl="3">
       <w:isLgl w:val="false"/>
       <w:lvlJc w:val="left"/>
-      <w:lvlText/>
+      <w:lvlText w:val=""/>
       <w:numFmt w:val="bullet"/>
       <w:pPr>
         <w:pBdr/>
@@ -7392,7 +7398,7 @@
     <w:lvl w:ilvl="4">
       <w:isLgl w:val="false"/>
       <w:lvlJc w:val="left"/>
-      <w:lvlText/>
+      <w:lvlText w:val=""/>
       <w:numFmt w:val="bullet"/>
       <w:pPr>
         <w:pBdr/>
@@ -7406,7 +7412,7 @@
     <w:lvl w:ilvl="5">
       <w:isLgl w:val="false"/>
       <w:lvlJc w:val="left"/>
-      <w:lvlText/>
+      <w:lvlText w:val=""/>
       <w:numFmt w:val="bullet"/>
       <w:pPr>
         <w:pBdr/>
@@ -7420,7 +7426,7 @@
     <w:lvl w:ilvl="6">
       <w:isLgl w:val="false"/>
       <w:lvlJc w:val="left"/>
-      <w:lvlText/>
+      <w:lvlText w:val=""/>
       <w:numFmt w:val="bullet"/>
       <w:pPr>
         <w:pBdr/>
@@ -7434,7 +7440,7 @@
     <w:lvl w:ilvl="7">
       <w:isLgl w:val="false"/>
       <w:lvlJc w:val="left"/>
-      <w:lvlText/>
+      <w:lvlText w:val=""/>
       <w:numFmt w:val="bullet"/>
       <w:pPr>
         <w:pBdr/>
@@ -7448,7 +7454,7 @@
     <w:lvl w:ilvl="8">
       <w:isLgl w:val="false"/>
       <w:lvlJc w:val="left"/>
-      <w:lvlText/>
+      <w:lvlText w:val=""/>
       <w:numFmt w:val="bullet"/>
       <w:pPr>
         <w:pBdr/>
@@ -10012,7 +10018,7 @@
     <w:lvl w:ilvl="1">
       <w:isLgl w:val="false"/>
       <w:lvlJc w:val="left"/>
-      <w:lvlText/>
+      <w:lvlText w:val=""/>
       <w:numFmt w:val="bullet"/>
       <w:pPr>
         <w:pBdr/>
@@ -10026,7 +10032,7 @@
     <w:lvl w:ilvl="2">
       <w:isLgl w:val="false"/>
       <w:lvlJc w:val="left"/>
-      <w:lvlText/>
+      <w:lvlText w:val=""/>
       <w:numFmt w:val="bullet"/>
       <w:pPr>
         <w:pBdr/>
@@ -10040,7 +10046,7 @@
     <w:lvl w:ilvl="3">
       <w:isLgl w:val="false"/>
       <w:lvlJc w:val="left"/>
-      <w:lvlText/>
+      <w:lvlText w:val=""/>
       <w:numFmt w:val="bullet"/>
       <w:pPr>
         <w:pBdr/>
@@ -10054,7 +10060,7 @@
     <w:lvl w:ilvl="4">
       <w:isLgl w:val="false"/>
       <w:lvlJc w:val="left"/>
-      <w:lvlText/>
+      <w:lvlText w:val=""/>
       <w:numFmt w:val="bullet"/>
       <w:pPr>
         <w:pBdr/>
@@ -10068,7 +10074,7 @@
     <w:lvl w:ilvl="5">
       <w:isLgl w:val="false"/>
       <w:lvlJc w:val="left"/>
-      <w:lvlText/>
+      <w:lvlText w:val=""/>
       <w:numFmt w:val="bullet"/>
       <w:pPr>
         <w:pBdr/>
@@ -10082,7 +10088,7 @@
     <w:lvl w:ilvl="6">
       <w:isLgl w:val="false"/>
       <w:lvlJc w:val="left"/>
-      <w:lvlText/>
+      <w:lvlText w:val=""/>
       <w:numFmt w:val="bullet"/>
       <w:pPr>
         <w:pBdr/>
@@ -10096,7 +10102,7 @@
     <w:lvl w:ilvl="7">
       <w:isLgl w:val="false"/>
       <w:lvlJc w:val="left"/>
-      <w:lvlText/>
+      <w:lvlText w:val=""/>
       <w:numFmt w:val="bullet"/>
       <w:pPr>
         <w:pBdr/>
@@ -10110,7 +10116,7 @@
     <w:lvl w:ilvl="8">
       <w:isLgl w:val="false"/>
       <w:lvlJc w:val="left"/>
-      <w:lvlText/>
+      <w:lvlText w:val=""/>
       <w:numFmt w:val="bullet"/>
       <w:pPr>
         <w:pBdr/>
@@ -10620,7 +10626,7 @@
     <w:lvl w:ilvl="2">
       <w:isLgl w:val="false"/>
       <w:lvlJc w:val="left"/>
-      <w:lvlText/>
+      <w:lvlText w:val=""/>
       <w:numFmt w:val="none"/>
       <w:pPr>
         <w:pBdr/>
@@ -10637,7 +10643,7 @@
     <w:lvl w:ilvl="3">
       <w:isLgl w:val="false"/>
       <w:lvlJc w:val="left"/>
-      <w:lvlText/>
+      <w:lvlText w:val=""/>
       <w:numFmt w:val="none"/>
       <w:pPr>
         <w:pBdr/>
@@ -10654,7 +10660,7 @@
     <w:lvl w:ilvl="4">
       <w:isLgl w:val="false"/>
       <w:lvlJc w:val="left"/>
-      <w:lvlText/>
+      <w:lvlText w:val=""/>
       <w:numFmt w:val="none"/>
       <w:pPr>
         <w:pBdr/>
@@ -10671,7 +10677,7 @@
     <w:lvl w:ilvl="5">
       <w:isLgl w:val="false"/>
       <w:lvlJc w:val="left"/>
-      <w:lvlText/>
+      <w:lvlText w:val=""/>
       <w:numFmt w:val="none"/>
       <w:pPr>
         <w:pBdr/>
@@ -10688,7 +10694,7 @@
     <w:lvl w:ilvl="6">
       <w:isLgl w:val="false"/>
       <w:lvlJc w:val="left"/>
-      <w:lvlText/>
+      <w:lvlText w:val=""/>
       <w:numFmt w:val="none"/>
       <w:pPr>
         <w:pBdr/>
@@ -10705,7 +10711,7 @@
     <w:lvl w:ilvl="7">
       <w:isLgl w:val="false"/>
       <w:lvlJc w:val="left"/>
-      <w:lvlText/>
+      <w:lvlText w:val=""/>
       <w:numFmt w:val="none"/>
       <w:pPr>
         <w:pBdr/>
@@ -10722,7 +10728,7 @@
     <w:lvl w:ilvl="8">
       <w:isLgl w:val="false"/>
       <w:lvlJc w:val="left"/>
-      <w:lvlText/>
+      <w:lvlText w:val=""/>
       <w:numFmt w:val="none"/>
       <w:pPr>
         <w:pBdr/>
@@ -11167,7 +11173,7 @@
     <w:lvl w:ilvl="1">
       <w:isLgl w:val="false"/>
       <w:lvlJc w:val="left"/>
-      <w:lvlText/>
+      <w:lvlText w:val=""/>
       <w:numFmt w:val="bullet"/>
       <w:pPr>
         <w:pBdr/>
@@ -11181,7 +11187,7 @@
     <w:lvl w:ilvl="2">
       <w:isLgl w:val="false"/>
       <w:lvlJc w:val="left"/>
-      <w:lvlText/>
+      <w:lvlText w:val=""/>
       <w:numFmt w:val="bullet"/>
       <w:pPr>
         <w:pBdr/>
@@ -11195,7 +11201,7 @@
     <w:lvl w:ilvl="3">
       <w:isLgl w:val="false"/>
       <w:lvlJc w:val="left"/>
-      <w:lvlText/>
+      <w:lvlText w:val=""/>
       <w:numFmt w:val="bullet"/>
       <w:pPr>
         <w:pBdr/>
@@ -11209,7 +11215,7 @@
     <w:lvl w:ilvl="4">
       <w:isLgl w:val="false"/>
       <w:lvlJc w:val="left"/>
-      <w:lvlText/>
+      <w:lvlText w:val=""/>
       <w:numFmt w:val="bullet"/>
       <w:pPr>
         <w:pBdr/>
@@ -11223,7 +11229,7 @@
     <w:lvl w:ilvl="5">
       <w:isLgl w:val="false"/>
       <w:lvlJc w:val="left"/>
-      <w:lvlText/>
+      <w:lvlText w:val=""/>
       <w:numFmt w:val="bullet"/>
       <w:pPr>
         <w:pBdr/>
@@ -11237,7 +11243,7 @@
     <w:lvl w:ilvl="6">
       <w:isLgl w:val="false"/>
       <w:lvlJc w:val="left"/>
-      <w:lvlText/>
+      <w:lvlText w:val=""/>
       <w:numFmt w:val="bullet"/>
       <w:pPr>
         <w:pBdr/>
@@ -11251,7 +11257,7 @@
     <w:lvl w:ilvl="7">
       <w:isLgl w:val="false"/>
       <w:lvlJc w:val="left"/>
-      <w:lvlText/>
+      <w:lvlText w:val=""/>
       <w:numFmt w:val="bullet"/>
       <w:pPr>
         <w:pBdr/>
@@ -11265,7 +11271,7 @@
     <w:lvl w:ilvl="8">
       <w:isLgl w:val="false"/>
       <w:lvlJc w:val="left"/>
-      <w:lvlText/>
+      <w:lvlText w:val=""/>
       <w:numFmt w:val="bullet"/>
       <w:pPr>
         <w:pBdr/>

</xml_diff>